<commit_message>
KB Section 3: commercial unit footprint, 4ft by 4ft
Confirmed by Scott. Space is the first practical objection a facility raises
and the figure was live in Commercial Drip touch 8 while appearing nowhere
agents could reach it. Also records that it needs no dedicated room, since
hallway and alcove siting is how facilities actually place it.

Co-Authored-By: Claude Opus 5 <noreply@anthropic.com>
</commit_message>
<xml_diff>
--- a/campaigns/commercial-drip.docx
+++ b/campaigns/commercial-drip.docx
@@ -1742,13 +1742,13 @@
           <w:b/>
           <w:bCs/>
         </w:rPr>
-        <w:t xml:space="preserve">UNVERIFIED SPEC:</w:t>
-      </w:r>
-      <w:r>
-        <w:t xml:space="preserve"> </w:t>
-      </w:r>
-      <w:r>
-        <w:t xml:space="preserve">the 4x4 feet floor space figure appears nowhere in the KB, the handoff or the Implementation Guide. Space is the first practical objection a facility raises, so if the number is right it belongs in the KB where agents can reach it. Confirm and record.</w:t>
+        <w:t xml:space="preserve">VERIFIED (Aug 2)</w:t>
+      </w:r>
+      <w:r>
+        <w:t xml:space="preserve"> </w:t>
+      </w:r>
+      <w:r>
+        <w:t xml:space="preserve">by Scott and recorded in KB Section 3, so agents can answer the same question.</w:t>
       </w:r>
     </w:p>
     <w:p>
@@ -2076,14 +2076,6 @@
     </w:p>
     <w:tbl>
       <w:tblPr>
-        <w:tblBorders>
-          <w:top w:val="single" w:sz="6" w:space="0" w:color="AAAAAA"/>
-          <w:left w:val="single" w:sz="6" w:space="0" w:color="AAAAAA"/>
-          <w:bottom w:val="single" w:sz="6" w:space="0" w:color="AAAAAA"/>
-          <w:right w:val="single" w:sz="6" w:space="0" w:color="AAAAAA"/>
-          <w:insideH w:val="single" w:sz="6" w:space="0" w:color="AAAAAA"/>
-          <w:insideV w:val="single" w:sz="6" w:space="0" w:color="AAAAAA"/>
-        </w:tblBorders>
         <w:tblStyle w:val="Table"/>
         <w:tblW w:type="pct" w:w="5000"/>
         <w:tblLayout w:type="fixed"/>
@@ -2527,28 +2519,6 @@
       </w:pPr>
       <w:r>
         <w:t xml:space="preserve">Still open</w:t>
-      </w:r>
-    </w:p>
-    <w:p>
-      <w:pPr>
-        <w:pStyle w:val="Compact"/>
-        <w:numPr>
-          <w:ilvl w:val="0"/>
-          <w:numId w:val="1001"/>
-        </w:numPr>
-      </w:pPr>
-      <w:r>
-        <w:rPr>
-          <w:b/>
-          <w:bCs/>
-        </w:rPr>
-        <w:t xml:space="preserve">4x4 feet space spec</w:t>
-      </w:r>
-      <w:r>
-        <w:t xml:space="preserve"> </w:t>
-      </w:r>
-      <w:r>
-        <w:t xml:space="preserve">in touch 8, unverified, see the note there.</w:t>
       </w:r>
     </w:p>
     <w:p>

</xml_diff>

<commit_message>
Commercial Drip Touch 7: document the referral revenue line, live in GHL
Scott applied and published this after Truemed confirmed the commercial-side
determination. Documenting to match, with Scott's edit to "your unique link
to our shop page" retained.

Records why the wording is load-bearing: eligibility turns on who the buyer
of record is, so "purchase directly from us" must not be shortened to "buy
through you" -- that describes the facility-as-reseller case Truemed excluded
and would make the claim false. The closing boundary paragraph is likewise
not padding; without it an operator can read the offer as putting their own
unit on HSA.

Flags the one unquantified claim in the email: there is still no commission
figure, in a drip where every other claim carries a number.

Co-Authored-By: Claude Opus 5 <noreply@anthropic.com>
</commit_message>
<xml_diff>
--- a/campaigns/commercial-drip.docx
+++ b/campaigns/commercial-drip.docx
@@ -1452,6 +1452,54 @@
         <w:rPr>
           <w:rStyle w:val="VerbatimChar"/>
         </w:rPr>
+        <w:t xml:space="preserve">There is also a second revenue line, and it costs you nothing to carry.</w:t>
+      </w:r>
+      <w:r>
+        <w:br/>
+      </w:r>
+      <w:r>
+        <w:br/>
+      </w:r>
+      <w:r>
+        <w:rPr>
+          <w:rStyle w:val="VerbatimChar"/>
+        </w:rPr>
+        <w:t xml:space="preserve">Some of your members will want one at home. You do not buy inventory or stock anything. You send them your unique link to our shop page, they purchase directly from us, and you are credited the commission on the sale.</w:t>
+      </w:r>
+      <w:r>
+        <w:br/>
+      </w:r>
+      <w:r>
+        <w:br/>
+      </w:r>
+      <w:r>
+        <w:rPr>
+          <w:rStyle w:val="VerbatimChar"/>
+        </w:rPr>
+        <w:t xml:space="preserve">Because it is their own purchase rather than yours, the home platform is HSA/FSA eligible through Truemed. For a lot of members that changes what $2,995 actually costs them, which makes it a considerably easier yes.</w:t>
+      </w:r>
+      <w:r>
+        <w:br/>
+      </w:r>
+      <w:r>
+        <w:br/>
+      </w:r>
+      <w:r>
+        <w:rPr>
+          <w:rStyle w:val="VerbatimChar"/>
+        </w:rPr>
+        <w:t xml:space="preserve">One distinction worth being precise about: that eligibility belongs to the member, not to the facility. It applies to an individual buying their own unit. It does not apply to what your facility buys, or to membership and session fees.</w:t>
+      </w:r>
+      <w:r>
+        <w:br/>
+      </w:r>
+      <w:r>
+        <w:br/>
+      </w:r>
+      <w:r>
+        <w:rPr>
+          <w:rStyle w:val="VerbatimChar"/>
+        </w:rPr>
         <w:t xml:space="preserve">I would love to show you the full picture in a 20-minute call.</w:t>
       </w:r>
       <w:r>
@@ -1523,6 +1571,202 @@
           <w:bCs/>
         </w:rPr>
         <w:t xml:space="preserve">Commercial Discovery</w:t>
+      </w:r>
+    </w:p>
+    <w:p>
+      <w:pPr>
+        <w:pStyle w:val="BodyText"/>
+      </w:pPr>
+      <w:r>
+        <w:rPr>
+          <w:b/>
+          <w:bCs/>
+        </w:rPr>
+        <w:t xml:space="preserve">UPDATED Aug 14.</w:t>
+      </w:r>
+      <w:r>
+        <w:t xml:space="preserve"> </w:t>
+      </w:r>
+      <w:r>
+        <w:t xml:space="preserve">Added the referral revenue line after Truemed confirmed the commercial-side determination. Live in GHL.</w:t>
+      </w:r>
+    </w:p>
+    <w:p>
+      <w:pPr>
+        <w:pStyle w:val="BodyText"/>
+      </w:pPr>
+      <w:r>
+        <w:rPr>
+          <w:b/>
+          <w:bCs/>
+        </w:rPr>
+        <w:t xml:space="preserve">The wording is load-bearing. Do not shorten</w:t>
+      </w:r>
+      <w:r>
+        <w:rPr>
+          <w:b/>
+          <w:bCs/>
+        </w:rPr>
+        <w:t xml:space="preserve"> </w:t>
+      </w:r>
+      <w:r>
+        <w:rPr>
+          <w:b/>
+          <w:bCs/>
+        </w:rPr>
+        <w:t xml:space="preserve">“purchase directly from us”</w:t>
+      </w:r>
+      <w:r>
+        <w:rPr>
+          <w:b/>
+          <w:bCs/>
+        </w:rPr>
+        <w:t xml:space="preserve"> </w:t>
+      </w:r>
+      <w:r>
+        <w:rPr>
+          <w:b/>
+          <w:bCs/>
+        </w:rPr>
+        <w:t xml:space="preserve">to</w:t>
+      </w:r>
+      <w:r>
+        <w:rPr>
+          <w:b/>
+          <w:bCs/>
+        </w:rPr>
+        <w:t xml:space="preserve"> </w:t>
+      </w:r>
+      <w:r>
+        <w:rPr>
+          <w:b/>
+          <w:bCs/>
+        </w:rPr>
+        <w:t xml:space="preserve">“buy through you.”</w:t>
+      </w:r>
+      <w:r>
+        <w:t xml:space="preserve"> </w:t>
+      </w:r>
+      <w:r>
+        <w:t xml:space="preserve">Eligibility turns on</w:t>
+      </w:r>
+      <w:r>
+        <w:t xml:space="preserve"> </w:t>
+      </w:r>
+      <w:r>
+        <w:rPr>
+          <w:b/>
+          <w:bCs/>
+        </w:rPr>
+        <w:t xml:space="preserve">who the buyer of record is</w:t>
+      </w:r>
+      <w:r>
+        <w:t xml:space="preserve">, not on whether a facility was involved. A facility buying units for its business is a business expense and is NOT eligible, which is what Truemed ruled out. An individual buying their own Consumer Unit at</w:t>
+      </w:r>
+      <w:r>
+        <w:t xml:space="preserve"> </w:t>
+      </w:r>
+      <w:r>
+        <w:rPr>
+          <w:rStyle w:val="VerbatimChar"/>
+        </w:rPr>
+        <w:t xml:space="preserve">shop.enyrgy.com</w:t>
+      </w:r>
+      <w:r>
+        <w:t xml:space="preserve"> </w:t>
+      </w:r>
+      <w:r>
+        <w:t xml:space="preserve">through the facility’s unique referral link IS eligible, because the consumer is the purchaser and the facility is credited as referrer rather than reseller.</w:t>
+      </w:r>
+      <w:r>
+        <w:t xml:space="preserve"> </w:t>
+      </w:r>
+      <w:r>
+        <w:t xml:space="preserve">“Buy through you”</w:t>
+      </w:r>
+      <w:r>
+        <w:t xml:space="preserve"> </w:t>
+      </w:r>
+      <w:r>
+        <w:t xml:space="preserve">describes the excluded arrangement and would make the claim false.</w:t>
+      </w:r>
+    </w:p>
+    <w:p>
+      <w:pPr>
+        <w:pStyle w:val="BodyText"/>
+      </w:pPr>
+      <w:r>
+        <w:rPr>
+          <w:b/>
+          <w:bCs/>
+        </w:rPr>
+        <w:t xml:space="preserve">The fourth paragraph is not padding.</w:t>
+      </w:r>
+      <w:r>
+        <w:t xml:space="preserve"> </w:t>
+      </w:r>
+      <w:r>
+        <w:t xml:space="preserve">Without it an operator can read the offer as</w:t>
+      </w:r>
+      <w:r>
+        <w:t xml:space="preserve"> </w:t>
+      </w:r>
+      <w:r>
+        <w:t xml:space="preserve">“we can put our own unit on HSA,”</w:t>
+      </w:r>
+      <w:r>
+        <w:t xml:space="preserve"> </w:t>
+      </w:r>
+      <w:r>
+        <w:t xml:space="preserve">which is the exact inference to prevent. See KB §3 payment options and Master TODO §4b.</w:t>
+      </w:r>
+    </w:p>
+    <w:p>
+      <w:pPr>
+        <w:pStyle w:val="BodyText"/>
+      </w:pPr>
+      <w:r>
+        <w:rPr>
+          <w:b/>
+          <w:bCs/>
+        </w:rPr>
+        <w:t xml:space="preserve">Cannibalization is answered structurally.</w:t>
+      </w:r>
+      <w:r>
+        <w:t xml:space="preserve"> </w:t>
+      </w:r>
+      <w:r>
+        <w:t xml:space="preserve">An earlier draft had the facility reselling units, which raised the obvious objection that selling a member a home unit costs the operator recurring revenue. As a zero-inventory referral, that objection barely forms.</w:t>
+      </w:r>
+    </w:p>
+    <w:p>
+      <w:pPr>
+        <w:pStyle w:val="BodyText"/>
+      </w:pPr>
+      <w:r>
+        <w:rPr>
+          <w:b/>
+          <w:bCs/>
+        </w:rPr>
+        <w:t xml:space="preserve">Still open: no commission figure.</w:t>
+      </w:r>
+      <w:r>
+        <w:t xml:space="preserve"> </w:t>
+      </w:r>
+      <w:r>
+        <w:t xml:space="preserve">Every other claim in this drip carries a number ($8,950, $49 to $125, six weeks to four months).</w:t>
+      </w:r>
+      <w:r>
+        <w:t xml:space="preserve"> </w:t>
+      </w:r>
+      <w:r>
+        <w:t xml:space="preserve">“You are credited the commission”</w:t>
+      </w:r>
+      <w:r>
+        <w:t xml:space="preserve"> </w:t>
+      </w:r>
+      <w:r>
+        <w:t xml:space="preserve">is the one unquantified claim in the email, and it is the sentence an operator will actually weigh. Add a rate or per-unit amount once one is set.</w:t>
       </w:r>
     </w:p>
     <w:p>
@@ -2076,14 +2320,6 @@
     </w:p>
     <w:tbl>
       <w:tblPr>
-        <w:tblBorders>
-          <w:top w:val="single" w:sz="6" w:space="0" w:color="AAAAAA"/>
-          <w:left w:val="single" w:sz="6" w:space="0" w:color="AAAAAA"/>
-          <w:bottom w:val="single" w:sz="6" w:space="0" w:color="AAAAAA"/>
-          <w:right w:val="single" w:sz="6" w:space="0" w:color="AAAAAA"/>
-          <w:insideH w:val="single" w:sz="6" w:space="0" w:color="AAAAAA"/>
-          <w:insideV w:val="single" w:sz="6" w:space="0" w:color="AAAAAA"/>
-        </w:tblBorders>
         <w:tblStyle w:val="Table"/>
         <w:tblW w:type="pct" w:w="5000"/>
         <w:tblLayout w:type="fixed"/>

</xml_diff>

<commit_message>
Commercial Drip Touch 7: sync $600 commission figure, now live
Scott published the figure in GHL and re-synced the KB skill. Documenting to
match: 'credited the commission' is now 'credited $600 on the sale'.

Records that the '15 referrals covers your unit' line was considered and
deliberately excluded, so it is not rediscovered as an obvious improvement.
Touch 7 already carries a payback story from client fees; a second payback
frame in one email weakens the first.

Notes that because $600 now ships in the email, every facility on the drip
has the figure. KB 14 accounts for this: agents may confirm it, but referral
arrangements escalate to Scott.

Co-Authored-By: Claude Opus 5 <noreply@anthropic.com>
</commit_message>
<xml_diff>
--- a/campaigns/commercial-drip.docx
+++ b/campaigns/commercial-drip.docx
@@ -1464,7 +1464,7 @@
         <w:rPr>
           <w:rStyle w:val="VerbatimChar"/>
         </w:rPr>
-        <w:t xml:space="preserve">Some of your members will want one at home. You do not buy inventory or stock anything. You send them your unique link to our shop page, they purchase directly from us, and you are credited the commission on the sale.</w:t>
+        <w:t xml:space="preserve">Some of your members will want one at home. You do not buy inventory or stock anything. You send them your unique link to our shop page, they purchase directly from us, and you are credited $600 on the sale.</w:t>
       </w:r>
       <w:r>
         <w:br/>
@@ -1748,25 +1748,74 @@
           <w:b/>
           <w:bCs/>
         </w:rPr>
-        <w:t xml:space="preserve">Still open: no commission figure.</w:t>
-      </w:r>
-      <w:r>
-        <w:t xml:space="preserve"> </w:t>
-      </w:r>
-      <w:r>
-        <w:t xml:space="preserve">Every other claim in this drip carries a number ($8,950, $49 to $125, six weeks to four months).</w:t>
-      </w:r>
-      <w:r>
-        <w:t xml:space="preserve"> </w:t>
-      </w:r>
-      <w:r>
-        <w:t xml:space="preserve">“You are credited the commission”</w:t>
-      </w:r>
-      <w:r>
-        <w:t xml:space="preserve"> </w:t>
-      </w:r>
-      <w:r>
-        <w:t xml:space="preserve">is the one unquantified claim in the email, and it is the sentence an operator will actually weigh. Add a rate or per-unit amount once one is set.</w:t>
+        <w:t xml:space="preserve">RESOLVED Aug 14: the commission is $600 per Consumer Unit sale</w:t>
+      </w:r>
+      <w:r>
+        <w:t xml:space="preserve">, now stated in the copy. That was the last unquantified claim in an email where everything else carries a number.</w:t>
+      </w:r>
+    </w:p>
+    <w:p>
+      <w:pPr>
+        <w:pStyle w:val="BodyText"/>
+      </w:pPr>
+      <w:r>
+        <w:rPr>
+          <w:b/>
+          <w:bCs/>
+        </w:rPr>
+        <w:t xml:space="preserve">The</w:t>
+      </w:r>
+      <w:r>
+        <w:rPr>
+          <w:b/>
+          <w:bCs/>
+        </w:rPr>
+        <w:t xml:space="preserve"> </w:t>
+      </w:r>
+      <w:r>
+        <w:rPr>
+          <w:b/>
+          <w:bCs/>
+        </w:rPr>
+        <w:t xml:space="preserve">“15 referrals covers your unit”</w:t>
+      </w:r>
+      <w:r>
+        <w:rPr>
+          <w:b/>
+          <w:bCs/>
+        </w:rPr>
+        <w:t xml:space="preserve"> </w:t>
+      </w:r>
+      <w:r>
+        <w:rPr>
+          <w:b/>
+          <w:bCs/>
+        </w:rPr>
+        <w:t xml:space="preserve">line was considered and deliberately left out.</w:t>
+      </w:r>
+      <w:r>
+        <w:t xml:space="preserve"> </w:t>
+      </w:r>
+      <w:r>
+        <w:t xml:space="preserve">$600 against the $8,950 device is 15 referrals, which is arithmetic from two approved figures and a strong argument. It was excluded because Touch 7 already carries a payback story from client fees (six weeks to four months), and a second payback frame in the same email muddies the first. Do not add it back without deciding which payback story leads.</w:t>
+      </w:r>
+    </w:p>
+    <w:p>
+      <w:pPr>
+        <w:pStyle w:val="BodyText"/>
+      </w:pPr>
+      <w:r>
+        <w:rPr>
+          <w:b/>
+          <w:bCs/>
+        </w:rPr>
+        <w:t xml:space="preserve">Because $600 now ships in this email, every facility on the drip has the figure.</w:t>
+      </w:r>
+      <w:r>
+        <w:t xml:space="preserve"> </w:t>
+      </w:r>
+      <w:r>
+        <w:t xml:space="preserve">KB §14 accounts for that: an agent may confirm it if a facility quotes it back, but referral arrangements escalate to Scott, who handles them personally. Sales Outreach does not negotiate or extend terms.</w:t>
       </w:r>
     </w:p>
     <w:p>

</xml_diff>